<commit_message>
feat: corregidos las llamadas con callback
</commit_message>
<xml_diff>
--- a/informe-avances.docx
+++ b/informe-avances.docx
@@ -66,11 +66,7 @@
         <w:jc w:val="center"/>
       </w:pPr>
       <w:r>
-        <w:rPr>
-          <w:color w:val="5A6A7A"/>
-          <w:sz w:val="24"/>
-        </w:rPr>
-        <w:t>Versión 1.0 — 01/08/2026</w:t>
+        <w:t>Versión 1.1 — 11/08/2026</w:t>
       </w:r>
     </w:p>
     <w:p>
@@ -78,11 +74,7 @@
         <w:jc w:val="center"/>
       </w:pPr>
       <w:r>
-        <w:rPr>
-          <w:color w:val="5A6A7A"/>
-          <w:sz w:val="24"/>
-        </w:rPr>
-        <w:t>Periodo de desarrollo: 18 de junio de 2026 → 31 de julio de 2026</w:t>
+        <w:t>Periodo de desarrollo: 18 de junio de 2026 → 11 de agosto de 2026</w:t>
       </w:r>
     </w:p>
     <w:p>
@@ -90,11 +82,7 @@
         <w:jc w:val="center"/>
       </w:pPr>
       <w:r>
-        <w:rPr>
-          <w:color w:val="5A6A7A"/>
-          <w:sz w:val="24"/>
-        </w:rPr>
-        <w:t>Rama: dev · ~100 commits · 431 archivos cambiados/agregados</w:t>
+        <w:t>Rama: dev · 153 commits · 534 archivos cambiados/agregados</w:t>
       </w:r>
     </w:p>
     <w:p>
@@ -307,6 +295,28 @@
           </w:p>
         </w:tc>
       </w:tr>
+      <w:tr>
+        <w:tc>
+          <w:tcPr>
+            <w:tcW w:type="dxa" w:w="4824"/>
+          </w:tcPr>
+          <w:p>
+            <w:r>
+              <w:t>Páginas públicas actualizadas</w:t>
+            </w:r>
+          </w:p>
+        </w:tc>
+        <w:tc>
+          <w:tcPr>
+            <w:tcW w:type="dxa" w:w="4824"/>
+          </w:tcPr>
+          <w:p>
+            <w:r>
+              <w:t>Orientación a Víctimas, YouTube, webinars/capacitaciones, banners y programas</w:t>
+            </w:r>
+          </w:p>
+        </w:tc>
+      </w:tr>
     </w:tbl>
     <w:p/>
     <w:p>
@@ -594,7 +604,7 @@
         <w:pStyle w:val="Heading3"/>
       </w:pPr>
       <w:r>
-        <w:t>25–31 jul 2026 — Fase 10 · Módulos finales y cierre</w:t>
+        <w:t>25–11 ago 2026 — Fase 10 · Módulos finales y cierre</w:t>
       </w:r>
     </w:p>
     <w:p>
@@ -2137,11 +2147,212 @@
     </w:p>
     <w:p>
       <w:r>
-        <w:rPr>
-          <w:i/>
-          <w:color w:val="5A6A7A"/>
-        </w:rPr>
-        <w:t>Informe generado a partir del historial de git (rama dev), periodo 18/06/2026 a 31/07/2026. Total de archivos considerados: 431.</w:t>
+        <w:t>Informe actualizado a partir del historial de git (rama dev), periodo 18/06/2026 a 11/08/2026. Total de archivos considerados: 534.</w:t>
+      </w:r>
+    </w:p>
+    <w:p>
+      <w:pPr>
+        <w:pStyle w:val="Heading1"/>
+      </w:pPr>
+      <w:r>
+        <w:t>4. Actualización al 11 de agosto de 2026</w:t>
+      </w:r>
+    </w:p>
+    <w:p>
+      <w:r>
+        <w:t>Esta sección incorpora los cambios implementados después de la versión anterior del informe y verifica su correspondencia con las rutas, vistas, API y migraciones actualmente presentes en el repositorio.</w:t>
+      </w:r>
+    </w:p>
+    <w:p>
+      <w:pPr>
+        <w:pStyle w:val="Heading2"/>
+      </w:pPr>
+      <w:r>
+        <w:t>4.1 Nuevas capacidades de la página pública</w:t>
+      </w:r>
+    </w:p>
+    <w:p>
+      <w:pPr>
+        <w:pStyle w:val="ListBullet"/>
+      </w:pPr>
+      <w:r>
+        <w:t>Orientación a Víctimas: nueva página bilingüe accesible mediante /programas/orientacion-victimas y /programas/orientacion-a-victimas. Incluye información de apoyo, guía de denuncia, seguimiento, SOAT, enlaces externos y formulario de orientación conectado al proxy /api/orv-form.</w:t>
+      </w:r>
+    </w:p>
+    <w:p>
+      <w:pPr>
+        <w:pStyle w:val="ListBullet"/>
+      </w:pPr>
+      <w:r>
+        <w:t>YouTube en la página de inicio: la sección multimedia carga videos administrables desde la base de datos, muestra miniaturas y permite seleccionar el video principal desde la lista.</w:t>
+      </w:r>
+    </w:p>
+    <w:p>
+      <w:pPr>
+        <w:pStyle w:val="ListBullet"/>
+      </w:pPr>
+      <w:r>
+        <w:t>Webinars y capacitaciones: las páginas /webinars y /capacitaciones muestran el video seleccionado, su título y descripción, con acceso directo a YouTube.</w:t>
+      </w:r>
+    </w:p>
+    <w:p>
+      <w:pPr>
+        <w:pStyle w:val="ListBullet"/>
+      </w:pPr>
+      <w:r>
+        <w:t>Programas institucionales: el menú público se alimenta de programas activos, con título y enlace web administrables desde el panel.</w:t>
+      </w:r>
+    </w:p>
+    <w:p>
+      <w:pPr>
+        <w:pStyle w:val="ListBullet"/>
+      </w:pPr>
+      <w:r>
+        <w:t>Banners del inicio: el carrusel ahora obtiene imágenes y textos ES/EN desde la base de datos; mantiene tres posiciones, reordenamiento y enlaces internos o externos.</w:t>
+      </w:r>
+    </w:p>
+    <w:p>
+      <w:pPr>
+        <w:pStyle w:val="ListBullet"/>
+      </w:pPr>
+      <w:r>
+        <w:t>Componentes tecnológicos: los componentes de la página de inicio y de Quiénes somos se consultan desde su tabla propia, con enlaces y fallback visual para iconos.</w:t>
+      </w:r>
+    </w:p>
+    <w:p>
+      <w:pPr>
+        <w:pStyle w:val="Heading2"/>
+      </w:pPr>
+      <w:r>
+        <w:t>4.2 SEO, seguridad y operación</w:t>
+      </w:r>
+    </w:p>
+    <w:p>
+      <w:pPr>
+        <w:pStyle w:val="ListBullet"/>
+      </w:pPr>
+      <w:r>
+        <w:t>Metadatos SEO por ruta: títulos, descripciones, canonical, robots, Open Graph y Twitter Cards; además de datos estructurados JSON-LD para páginas, artículos, eventos, colecciones, contacto y búsqueda.</w:t>
+      </w:r>
+    </w:p>
+    <w:p>
+      <w:pPr>
+        <w:pStyle w:val="ListBullet"/>
+      </w:pPr>
+      <w:r>
+        <w:t>Sitemap dinámico en /sitemap y /sitemap.xml, robots.txt y rutas canónicas para evitar duplicidad de contenido.</w:t>
+      </w:r>
+    </w:p>
+    <w:p>
+      <w:pPr>
+        <w:pStyle w:val="ListBullet"/>
+      </w:pPr>
+      <w:r>
+        <w:t>Cabeceras de seguridad mediante Helmet, límites de frecuencia para login y formularios, validación de entradas y restricciones de tipo/tamaño en subidas.</w:t>
+      </w:r>
+    </w:p>
+    <w:p>
+      <w:pPr>
+        <w:pStyle w:val="ListBullet"/>
+      </w:pPr>
+      <w:r>
+        <w:t>Contraseñas nuevas con bcrypt; las credenciales AES heredadas se validan y migran transparentemente a bcrypt durante el inicio de sesión.</w:t>
+      </w:r>
+    </w:p>
+    <w:p>
+      <w:pPr>
+        <w:pStyle w:val="ListBullet"/>
+      </w:pPr>
+      <w:r>
+        <w:t>El contenido sensible de configuración permanece en variables de entorno; los documentos no incluyen claves, tokens ni valores del archivo .env.</w:t>
+      </w:r>
+    </w:p>
+    <w:p>
+      <w:pPr>
+        <w:pStyle w:val="Heading2"/>
+      </w:pPr>
+      <w:r>
+        <w:t>4.3 Nuevos módulos y soporte del panel</w:t>
+      </w:r>
+    </w:p>
+    <w:p>
+      <w:pPr>
+        <w:pStyle w:val="ListBullet"/>
+      </w:pPr>
+      <w:r>
+        <w:t>YouTube: CRUD de videos por sección (Home, Webinars y Capacitaciones), con título, descripción y URL validada para formatos youtu.be, watch, embed y shorts.</w:t>
+      </w:r>
+    </w:p>
+    <w:p>
+      <w:pPr>
+        <w:pStyle w:val="ListBullet"/>
+      </w:pPr>
+      <w:r>
+        <w:t>Banners: edición de imagen, textos por idioma, enlaces de botones y orden del carrusel desde la SPA React/TypeScript.</w:t>
+      </w:r>
+    </w:p>
+    <w:p>
+      <w:pPr>
+        <w:pStyle w:val="ListBullet"/>
+      </w:pPr>
+      <w:r>
+        <w:t>Programas: CRUD con título, enlace web, estado activo y código generado automáticamente cuando no se proporciona.</w:t>
+      </w:r>
+    </w:p>
+    <w:p>
+      <w:pPr>
+        <w:pStyle w:val="ListBullet"/>
+      </w:pPr>
+      <w:r>
+        <w:t>Logs y autenticación: las operaciones administrativas siguen registrándose y la sesión se valida mediante middleware protegido.</w:t>
+      </w:r>
+    </w:p>
+    <w:p>
+      <w:pPr>
+        <w:pStyle w:val="Heading2"/>
+      </w:pPr>
+      <w:r>
+        <w:t>4.4 Migraciones y archivos relevantes incorporados</w:t>
+      </w:r>
+    </w:p>
+    <w:p>
+      <w:pPr>
+        <w:pStyle w:val="ListBullet"/>
+      </w:pPr>
+      <w:r>
+        <w:t>scripts_db/2026-08-03_create_banners.sql y 2026-08-04_banners_textos.sql.</w:t>
+      </w:r>
+    </w:p>
+    <w:p>
+      <w:pPr>
+        <w:pStyle w:val="ListBullet"/>
+      </w:pPr>
+      <w:r>
+        <w:t>scripts_db/2026-08-05_seed_programa_orientacion_victimas.sql y 2026-08-07_seed_programa_orientacion_victimas_enlace.sql.</w:t>
+      </w:r>
+    </w:p>
+    <w:p>
+      <w:pPr>
+        <w:pStyle w:val="ListBullet"/>
+      </w:pPr>
+      <w:r>
+        <w:t>scripts_db/2026-08-07_create_componentes_tecnologicos.sql y actualización de enlaces de componentes.</w:t>
+      </w:r>
+    </w:p>
+    <w:p>
+      <w:pPr>
+        <w:pStyle w:val="ListBullet"/>
+      </w:pPr>
+      <w:r>
+        <w:t>scripts_db/2026-08-10_create_youtube_videos.sql.</w:t>
+      </w:r>
+    </w:p>
+    <w:p>
+      <w:pPr>
+        <w:pStyle w:val="ListBullet"/>
+      </w:pPr>
+      <w:r>
+        <w:t>views/pages/programa-orientacion-victimas.hbs, routes/api/orv-proxy.js, api/gcp/Youtube.js y admin/src/pages/YoutubeVideos.tsx.</w:t>
       </w:r>
     </w:p>
     <w:sectPr>

</xml_diff>

<commit_message>
feat: imagenes del popup mejoradas
</commit_message>
<xml_diff>
--- a/informe-avances.docx
+++ b/informe-avances.docx
@@ -66,7 +66,7 @@
         <w:jc w:val="center"/>
       </w:pPr>
       <w:r>
-        <w:t>Versión 1.1 — 11/08/2026</w:t>
+        <w:t>Versión 1.2 — 13/08/2026</w:t>
       </w:r>
     </w:p>
     <w:p>
@@ -74,7 +74,7 @@
         <w:jc w:val="center"/>
       </w:pPr>
       <w:r>
-        <w:t>Periodo de desarrollo: 18 de junio de 2026 → 11 de agosto de 2026</w:t>
+        <w:t>Periodo de desarrollo: 18 de junio de 2026 → 13 de agosto de 2026</w:t>
       </w:r>
     </w:p>
     <w:p>
@@ -82,7 +82,7 @@
         <w:jc w:val="center"/>
       </w:pPr>
       <w:r>
-        <w:t>Rama: dev · 153 commits · 534 archivos cambiados/agregados</w:t>
+        <w:t>Rama: dev · 282 commits · 579 archivos cambiados/agregados</w:t>
       </w:r>
     </w:p>
     <w:p>
@@ -211,11 +211,7 @@
             <w:tcW w:type="dxa" w:w="6048"/>
           </w:tcPr>
           <w:p>
-            <w:r/>
             <w:r>
-              <w:rPr>
-                <w:sz w:val="20"/>
-              </w:rPr>
               <w:t>Páginas del panel admin (React/TS)</w:t>
             </w:r>
           </w:p>
@@ -225,12 +221,8 @@
             <w:tcW w:type="dxa" w:w="4032"/>
           </w:tcPr>
           <w:p>
-            <w:r/>
             <w:r>
-              <w:rPr>
-                <w:sz w:val="20"/>
-              </w:rPr>
-              <w:t>21</w:t>
+              <w:t>26</w:t>
             </w:r>
           </w:p>
         </w:tc>
@@ -241,11 +233,7 @@
             <w:tcW w:type="dxa" w:w="6048"/>
           </w:tcPr>
           <w:p>
-            <w:r/>
             <w:r>
-              <w:rPr>
-                <w:sz w:val="20"/>
-              </w:rPr>
               <w:t>Migraciones / scripts de BD</w:t>
             </w:r>
           </w:p>
@@ -255,12 +243,8 @@
             <w:tcW w:type="dxa" w:w="4032"/>
           </w:tcPr>
           <w:p>
-            <w:r/>
             <w:r>
-              <w:rPr>
-                <w:sz w:val="20"/>
-              </w:rPr>
-              <w:t>9</w:t>
+              <w:t>23</w:t>
             </w:r>
           </w:p>
         </w:tc>
@@ -312,7 +296,7 @@
           </w:tcPr>
           <w:p>
             <w:r>
-              <w:t>Orientación a Víctimas, YouTube, webinars/capacitaciones, banners y programas</w:t>
+              <w:t>Orientación a Víctimas, YouTube, webinars/capacitaciones, banners, programas (con detalle /programas/:slug), popup (carrusel) y noticias/notas de prensa (compartir)</w:t>
             </w:r>
           </w:p>
         </w:tc>
@@ -629,6 +613,62 @@
       </w:pPr>
       <w:r>
         <w:t>Buscador funcional para noticias y notas de prensa, mejoras finales y limpieza del código.</w:t>
+      </w:r>
+    </w:p>
+    <w:p>
+      <w:pPr>
+        <w:pStyle w:val="Heading3"/>
+      </w:pPr>
+      <w:r>
+        <w:t>12–13 ago 2026 — Fase 11 · Menú del sitio, accesos rápidos y carrusel del popup</w:t>
+      </w:r>
+    </w:p>
+    <w:p>
+      <w:pPr>
+        <w:pStyle w:val="ListBullet"/>
+      </w:pPr>
+      <w:r>
+        <w:t>Menú del Sitio (admin/src/pages/MenuSitio.tsx): nuevo módulo del panel para administrar los subitems del navbar por sección e idioma (ES/EN), con reordenamiento, marca de «abrir en pestaña nueva» y activación por ítem.</w:t>
+      </w:r>
+    </w:p>
+    <w:p>
+      <w:pPr>
+        <w:pStyle w:val="ListBullet"/>
+      </w:pPr>
+      <w:r>
+        <w:t>Accesos Rápidos (admin/src/pages/AccesosRapidos.tsx): tarjetas bilingües bajo el mapa de siniestros de la home, administrables desde el panel con imagen, eyebrow, título, descripción y botón.</w:t>
+      </w:r>
+    </w:p>
+    <w:p>
+      <w:pPr>
+        <w:pStyle w:val="ListBullet"/>
+      </w:pPr>
+      <w:r>
+        <w:t>Popup convertido en carrusel de slides (campo posicion): subida de imagen y enlace por slide, reordenamiento y activación global; en el portal añade botón Compartir (Web Share API / WhatsApp) y botones sociales Facebook/Twitter.</w:t>
+      </w:r>
+    </w:p>
+    <w:p>
+      <w:pPr>
+        <w:pStyle w:val="ListBullet"/>
+      </w:pPr>
+      <w:r>
+        <w:t>Programas con nuevos campos descripción e imagen (ALTER 2026-08-12) y página de detalle pública /programas/:slug.</w:t>
+      </w:r>
+    </w:p>
+    <w:p>
+      <w:pPr>
+        <w:pStyle w:val="ListBullet"/>
+      </w:pPr>
+      <w:r>
+        <w:t>YouTube refactorizado en un componente reutilizable YoutubeVideosManager, compartido por la home, Webinars y Capacitaciones (admin/src/pages/EducacionVial.tsx).</w:t>
+      </w:r>
+    </w:p>
+    <w:p>
+      <w:pPr>
+        <w:pStyle w:val="ListBullet"/>
+      </w:pPr>
+      <w:r>
+        <w:t>Botones de compartir (Web Share API / WhatsApp) en noticias y notas de prensa; paginador ONSV propio en /webinars.</w:t>
       </w:r>
     </w:p>
     <w:p>
@@ -1154,29 +1194,21 @@
       <w:tr>
         <w:tc>
           <w:tcPr>
-            <w:tcW w:type="dxa" w:w="2880"/>
+            <w:tcW w:type="dxa" w:w="4824"/>
           </w:tcPr>
           <w:p>
-            <w:r/>
             <w:r>
-              <w:rPr>
-                <w:sz w:val="20"/>
-              </w:rPr>
               <w:t>Login</w:t>
             </w:r>
           </w:p>
         </w:tc>
         <w:tc>
           <w:tcPr>
-            <w:tcW w:type="dxa" w:w="7200"/>
+            <w:tcW w:type="dxa" w:w="4824"/>
           </w:tcPr>
           <w:p>
-            <w:r/>
             <w:r>
-              <w:rPr>
-                <w:sz w:val="20"/>
-              </w:rPr>
-              <w:t>Formulario usuario/contraseña contra tabla users (password cifrado AES); redirect a /auth/success o /auth/fail.</w:t>
+              <w:t>Formulario usuario/contraseña contra tabla users (password cifrado AES, migración transparente a bcrypt); redirect a /auth/success o /auth/fail.</w:t>
             </w:r>
           </w:p>
         </w:tc>
@@ -1184,28 +1216,20 @@
       <w:tr>
         <w:tc>
           <w:tcPr>
-            <w:tcW w:type="dxa" w:w="2880"/>
+            <w:tcW w:type="dxa" w:w="4824"/>
           </w:tcPr>
           <w:p>
-            <w:r/>
             <w:r>
-              <w:rPr>
-                <w:sz w:val="20"/>
-              </w:rPr>
               <w:t>Dashboard</w:t>
             </w:r>
           </w:p>
         </w:tc>
         <w:tc>
           <w:tcPr>
-            <w:tcW w:type="dxa" w:w="7200"/>
+            <w:tcW w:type="dxa" w:w="4824"/>
           </w:tcPr>
           <w:p>
-            <w:r/>
             <w:r>
-              <w:rPr>
-                <w:sz w:val="20"/>
-              </w:rPr>
               <w:t>Estadísticas (usuarios, analítica activa, contenido publicado); actividad reciente en vivo (logs); accesos rápidos.</w:t>
             </w:r>
           </w:p>
@@ -1214,28 +1238,86 @@
       <w:tr>
         <w:tc>
           <w:tcPr>
-            <w:tcW w:type="dxa" w:w="2880"/>
+            <w:tcW w:type="dxa" w:w="4824"/>
           </w:tcPr>
           <w:p>
-            <w:r/>
             <w:r>
-              <w:rPr>
-                <w:sz w:val="20"/>
-              </w:rPr>
+              <w:t>Menú del sitio</w:t>
+            </w:r>
+          </w:p>
+        </w:tc>
+        <w:tc>
+          <w:tcPr>
+            <w:tcW w:type="dxa" w:w="4824"/>
+          </w:tcPr>
+          <w:p>
+            <w:r>
+              <w:t>CRUD de subitems del navbar por sección (6) e idioma (ES/EN), con URL, external, orden e isActive.</w:t>
+            </w:r>
+          </w:p>
+        </w:tc>
+      </w:tr>
+      <w:tr>
+        <w:tc>
+          <w:tcPr>
+            <w:tcW w:type="dxa" w:w="4824"/>
+          </w:tcPr>
+          <w:p>
+            <w:r>
+              <w:t>Banners</w:t>
+            </w:r>
+          </w:p>
+        </w:tc>
+        <w:tc>
+          <w:tcPr>
+            <w:tcW w:type="dxa" w:w="4824"/>
+          </w:tcPr>
+          <w:p>
+            <w:r>
+              <w:t>Edición bilingüe ES/EN de 3 slides (kicker, título, párrafo, botones), reordenamiento y subida de imagen.</w:t>
+            </w:r>
+          </w:p>
+        </w:tc>
+      </w:tr>
+      <w:tr>
+        <w:tc>
+          <w:tcPr>
+            <w:tcW w:type="dxa" w:w="4824"/>
+          </w:tcPr>
+          <w:p>
+            <w:r>
+              <w:t>Accesos Rápidos</w:t>
+            </w:r>
+          </w:p>
+        </w:tc>
+        <w:tc>
+          <w:tcPr>
+            <w:tcW w:type="dxa" w:w="4824"/>
+          </w:tcPr>
+          <w:p>
+            <w:r>
+              <w:t>CRUD bilingüe (ES/EN) de tarjetas de la home (eyebrow, título, descripción, botón e imagen).</w:t>
+            </w:r>
+          </w:p>
+        </w:tc>
+      </w:tr>
+      <w:tr>
+        <w:tc>
+          <w:tcPr>
+            <w:tcW w:type="dxa" w:w="4824"/>
+          </w:tcPr>
+          <w:p>
+            <w:r>
               <w:t>Cifras</w:t>
             </w:r>
           </w:p>
         </w:tc>
         <w:tc>
           <w:tcPr>
-            <w:tcW w:type="dxa" w:w="7200"/>
+            <w:tcW w:type="dxa" w:w="4824"/>
           </w:tcPr>
           <w:p>
-            <w:r/>
             <w:r>
-              <w:rPr>
-                <w:sz w:val="20"/>
-              </w:rPr>
               <w:t>Edición única de siniestros/lesionados/fallecidos, 2 mensajes y fuentes + porcentajes por indicador.</w:t>
             </w:r>
           </w:p>
@@ -1244,28 +1326,20 @@
       <w:tr>
         <w:tc>
           <w:tcPr>
-            <w:tcW w:type="dxa" w:w="2880"/>
+            <w:tcW w:type="dxa" w:w="4824"/>
           </w:tcPr>
           <w:p>
-            <w:r/>
             <w:r>
-              <w:rPr>
-                <w:sz w:val="20"/>
-              </w:rPr>
-              <w:t>Misión–Visión</w:t>
+              <w:t>Quienes Somos (Misión–Visión)</w:t>
             </w:r>
           </w:p>
         </w:tc>
         <w:tc>
           <w:tcPr>
-            <w:tcW w:type="dxa" w:w="7200"/>
+            <w:tcW w:type="dxa" w:w="4824"/>
           </w:tcPr>
           <w:p>
-            <w:r/>
             <w:r>
-              <w:rPr>
-                <w:sz w:val="20"/>
-              </w:rPr>
               <w:t>Edición bilingüe ES/EN de ~35 campos por idioma (definición, misión, visión, 6 valores, 9 componentes).</w:t>
             </w:r>
           </w:p>
@@ -1274,28 +1348,20 @@
       <w:tr>
         <w:tc>
           <w:tcPr>
-            <w:tcW w:type="dxa" w:w="2880"/>
+            <w:tcW w:type="dxa" w:w="4824"/>
           </w:tcPr>
           <w:p>
-            <w:r/>
             <w:r>
-              <w:rPr>
-                <w:sz w:val="20"/>
-              </w:rPr>
               <w:t>Regiones</w:t>
             </w:r>
           </w:p>
         </w:tc>
         <w:tc>
           <w:tcPr>
-            <w:tcW w:type="dxa" w:w="7200"/>
+            <w:tcW w:type="dxa" w:w="4824"/>
           </w:tcPr>
           <w:p>
-            <w:r/>
             <w:r>
-              <w:rPr>
-                <w:sz w:val="20"/>
-              </w:rPr>
               <w:t>Listado con búsqueda y paginación; edición de encargados con validación; subida de escudo (cache-busting ?v=).</w:t>
             </w:r>
           </w:p>
@@ -1304,28 +1370,20 @@
       <w:tr>
         <w:tc>
           <w:tcPr>
-            <w:tcW w:type="dxa" w:w="2880"/>
+            <w:tcW w:type="dxa" w:w="4824"/>
           </w:tcPr>
           <w:p>
-            <w:r/>
             <w:r>
-              <w:rPr>
-                <w:sz w:val="20"/>
-              </w:rPr>
               <w:t>Comunicaciones / Eventos</w:t>
             </w:r>
           </w:p>
         </w:tc>
         <w:tc>
           <w:tcPr>
-            <w:tcW w:type="dxa" w:w="7200"/>
+            <w:tcW w:type="dxa" w:w="4824"/>
           </w:tcPr>
           <w:p>
-            <w:r/>
             <w:r>
-              <w:rPr>
-                <w:sz w:val="20"/>
-              </w:rPr>
               <w:t>CRUD completo con 2 pestañas; filtros con debounce; modal de edición con todos los campos e imagen; activar/desactivar.</w:t>
             </w:r>
           </w:p>
@@ -1334,28 +1392,20 @@
       <w:tr>
         <w:tc>
           <w:tcPr>
-            <w:tcW w:type="dxa" w:w="2880"/>
+            <w:tcW w:type="dxa" w:w="4824"/>
           </w:tcPr>
           <w:p>
-            <w:r/>
             <w:r>
-              <w:rPr>
-                <w:sz w:val="20"/>
-              </w:rPr>
               <w:t>Noticias / Notas / Normas / Publicaciones</w:t>
             </w:r>
           </w:p>
         </w:tc>
         <w:tc>
           <w:tcPr>
-            <w:tcW w:type="dxa" w:w="7200"/>
+            <w:tcW w:type="dxa" w:w="4824"/>
           </w:tcPr>
           <w:p>
-            <w:r/>
             <w:r>
-              <w:rPr>
-                <w:sz w:val="20"/>
-              </w:rPr>
               <w:t>Listado de posts de Ghost CMS con paginación; toggle habilitar/deshabilitar (tabla publicaciones_estado).</w:t>
             </w:r>
           </w:p>
@@ -1364,28 +1414,20 @@
       <w:tr>
         <w:tc>
           <w:tcPr>
-            <w:tcW w:type="dxa" w:w="2880"/>
+            <w:tcW w:type="dxa" w:w="4824"/>
           </w:tcPr>
           <w:p>
-            <w:r/>
             <w:r>
-              <w:rPr>
-                <w:sz w:val="20"/>
-              </w:rPr>
               <w:t>Revistas + Temas</w:t>
             </w:r>
           </w:p>
         </w:tc>
         <w:tc>
           <w:tcPr>
-            <w:tcW w:type="dxa" w:w="7200"/>
+            <w:tcW w:type="dxa" w:w="4824"/>
           </w:tcPr>
           <w:p>
-            <w:r/>
             <w:r>
-              <w:rPr>
-                <w:sz w:val="20"/>
-              </w:rPr>
               <w:t>CRUD de revistas (título, tema, imagen, PDF, activo, slug); CRUD de temas con bloqueo de borrado si hay revistas.</w:t>
             </w:r>
           </w:p>
@@ -1394,28 +1436,20 @@
       <w:tr>
         <w:tc>
           <w:tcPr>
-            <w:tcW w:type="dxa" w:w="2880"/>
+            <w:tcW w:type="dxa" w:w="4824"/>
           </w:tcPr>
           <w:p>
-            <w:r/>
             <w:r>
-              <w:rPr>
-                <w:sz w:val="20"/>
-              </w:rPr>
               <w:t>Analítica</w:t>
             </w:r>
           </w:p>
         </w:tc>
         <w:tc>
           <w:tcPr>
-            <w:tcW w:type="dxa" w:w="7200"/>
+            <w:tcW w:type="dxa" w:w="4824"/>
           </w:tcPr>
           <w:p>
-            <w:r/>
             <w:r>
-              <w:rPr>
-                <w:sz w:val="20"/>
-              </w:rPr>
               <w:t>CRUD de menús (descripción, imagen, activo) y submenús (menú padre, ruta PowerBI, link video/PDF, estado).</w:t>
             </w:r>
           </w:p>
@@ -1424,29 +1458,21 @@
       <w:tr>
         <w:tc>
           <w:tcPr>
-            <w:tcW w:type="dxa" w:w="2880"/>
+            <w:tcW w:type="dxa" w:w="4824"/>
           </w:tcPr>
           <w:p>
-            <w:r/>
             <w:r>
-              <w:rPr>
-                <w:sz w:val="20"/>
-              </w:rPr>
               <w:t>Popup</w:t>
             </w:r>
           </w:p>
         </w:tc>
         <w:tc>
           <w:tcPr>
-            <w:tcW w:type="dxa" w:w="7200"/>
+            <w:tcW w:type="dxa" w:w="4824"/>
           </w:tcPr>
           <w:p>
-            <w:r/>
             <w:r>
-              <w:rPr>
-                <w:sz w:val="20"/>
-              </w:rPr>
-              <w:t>Configuración única: imagen, enlace y activo.</w:t>
+              <w:t>Carrusel de slides (imagen+enlace por slide, reordenamiento); activación global del aviso.</w:t>
             </w:r>
           </w:p>
         </w:tc>
@@ -1454,28 +1480,20 @@
       <w:tr>
         <w:tc>
           <w:tcPr>
-            <w:tcW w:type="dxa" w:w="2880"/>
+            <w:tcW w:type="dxa" w:w="4824"/>
           </w:tcPr>
           <w:p>
-            <w:r/>
             <w:r>
-              <w:rPr>
-                <w:sz w:val="20"/>
-              </w:rPr>
               <w:t>Datos Abiertos</w:t>
             </w:r>
           </w:p>
         </w:tc>
         <w:tc>
           <w:tcPr>
-            <w:tcW w:type="dxa" w:w="7200"/>
+            <w:tcW w:type="dxa" w:w="4824"/>
           </w:tcPr>
           <w:p>
-            <w:r/>
             <w:r>
-              <w:rPr>
-                <w:sz w:val="20"/>
-              </w:rPr>
               <w:t>CRUD de datasets con 4 tipos de archivo (Excel, PDF, CSV, Shapefile); CRUD de categorías (con ícono) y tipos.</w:t>
             </w:r>
           </w:p>
@@ -1484,28 +1502,20 @@
       <w:tr>
         <w:tc>
           <w:tcPr>
-            <w:tcW w:type="dxa" w:w="2880"/>
+            <w:tcW w:type="dxa" w:w="4824"/>
           </w:tcPr>
           <w:p>
-            <w:r/>
             <w:r>
-              <w:rPr>
-                <w:sz w:val="20"/>
-              </w:rPr>
               <w:t>Entornos Viales</w:t>
             </w:r>
           </w:p>
         </w:tc>
         <w:tc>
           <w:tcPr>
-            <w:tcW w:type="dxa" w:w="7200"/>
+            <w:tcW w:type="dxa" w:w="4824"/>
           </w:tcPr>
           <w:p>
-            <w:r/>
             <w:r>
-              <w:rPr>
-                <w:sz w:val="20"/>
-              </w:rPr>
               <w:t>CRUD de tarjetas (badge, título, descripción ES/EN, imagen, orden, activo).</w:t>
             </w:r>
           </w:p>
@@ -1514,28 +1524,64 @@
       <w:tr>
         <w:tc>
           <w:tcPr>
-            <w:tcW w:type="dxa" w:w="2880"/>
+            <w:tcW w:type="dxa" w:w="4824"/>
           </w:tcPr>
           <w:p>
-            <w:r/>
             <w:r>
-              <w:rPr>
-                <w:sz w:val="20"/>
-              </w:rPr>
+              <w:t>Programas</w:t>
+            </w:r>
+          </w:p>
+        </w:tc>
+        <w:tc>
+          <w:tcPr>
+            <w:tcW w:type="dxa" w:w="4824"/>
+          </w:tcPr>
+          <w:p>
+            <w:r>
+              <w:t>CRUD con código (autogenerado por slug), nombre, descripción, imagen, enlace web y estado activo; detalle público /programas/:slug.</w:t>
+            </w:r>
+          </w:p>
+        </w:tc>
+      </w:tr>
+      <w:tr>
+        <w:tc>
+          <w:tcPr>
+            <w:tcW w:type="dxa" w:w="4824"/>
+          </w:tcPr>
+          <w:p>
+            <w:r>
+              <w:t>Educación Vial</w:t>
+            </w:r>
+          </w:p>
+        </w:tc>
+        <w:tc>
+          <w:tcPr>
+            <w:tcW w:type="dxa" w:w="4824"/>
+          </w:tcPr>
+          <w:p>
+            <w:r>
+              <w:t>Gestión de videos de Webinars y Capacitaciones (reutiliza el componente YoutubeVideosManager).</w:t>
+            </w:r>
+          </w:p>
+        </w:tc>
+      </w:tr>
+      <w:tr>
+        <w:tc>
+          <w:tcPr>
+            <w:tcW w:type="dxa" w:w="4824"/>
+          </w:tcPr>
+          <w:p>
+            <w:r>
               <w:t>Pie de Página</w:t>
             </w:r>
           </w:p>
         </w:tc>
         <w:tc>
           <w:tcPr>
-            <w:tcW w:type="dxa" w:w="7200"/>
+            <w:tcW w:type="dxa" w:w="4824"/>
           </w:tcPr>
           <w:p>
-            <w:r/>
             <w:r>
-              <w:rPr>
-                <w:sz w:val="20"/>
-              </w:rPr>
               <w:t>Información (teléfono, dirección, correo, descripción, horario) y CRUD de redes sociales con imagen.</w:t>
             </w:r>
           </w:p>
@@ -1544,29 +1590,43 @@
       <w:tr>
         <w:tc>
           <w:tcPr>
-            <w:tcW w:type="dxa" w:w="2880"/>
+            <w:tcW w:type="dxa" w:w="4824"/>
           </w:tcPr>
           <w:p>
-            <w:r/>
             <w:r>
-              <w:rPr>
-                <w:sz w:val="20"/>
-              </w:rPr>
               <w:t>Usuarios / Roles</w:t>
             </w:r>
           </w:p>
         </w:tc>
         <w:tc>
           <w:tcPr>
-            <w:tcW w:type="dxa" w:w="7200"/>
+            <w:tcW w:type="dxa" w:w="4824"/>
           </w:tcPr>
           <w:p>
-            <w:r/>
             <w:r>
-              <w:rPr>
-                <w:sz w:val="20"/>
-              </w:rPr>
               <w:t>CRUD de usuarios (el admin principal no se borra) y CRUD de roles con permisos.</w:t>
+            </w:r>
+          </w:p>
+        </w:tc>
+      </w:tr>
+      <w:tr>
+        <w:tc>
+          <w:tcPr>
+            <w:tcW w:type="dxa" w:w="4824"/>
+          </w:tcPr>
+          <w:p>
+            <w:r>
+              <w:t>YouTube</w:t>
+            </w:r>
+          </w:p>
+        </w:tc>
+        <w:tc>
+          <w:tcPr>
+            <w:tcW w:type="dxa" w:w="4824"/>
+          </w:tcPr>
+          <w:p>
+            <w:r>
+              <w:t>CRUD de videos por sección (Home, Webinars, Capacitaciones) con validación de URL y miniatura automática.</w:t>
             </w:r>
           </w:p>
         </w:tc>
@@ -2146,8 +2206,442 @@
       </w:r>
     </w:p>
     <w:p>
-      <w:r>
-        <w:t>Informe actualizado a partir del historial de git (rama dev), periodo 18/06/2026 a 11/08/2026. Total de archivos considerados: 534.</w:t>
+      <w:pPr>
+        <w:pStyle w:val="Heading1"/>
+      </w:pPr>
+      <w:r>
+        <w:t>5. Actualización al 13 de agosto de 2026</w:t>
+      </w:r>
+    </w:p>
+    <w:p>
+      <w:pPr/>
+      <w:r>
+        <w:t>Esta sección incorpora los cambios implementados entre el commit 34db7b6 (11/08/2026) y el estado actual (HEAD, 13/08/2026), y verifica su correspondencia con las rutas, vistas, API y migraciones presentes en el repositorio.</w:t>
+      </w:r>
+    </w:p>
+    <w:p>
+      <w:pPr>
+        <w:pStyle w:val="Heading2"/>
+      </w:pPr>
+      <w:r>
+        <w:t>5.1 Nuevas tablas y migraciones de base de datos</w:t>
+      </w:r>
+    </w:p>
+    <w:p>
+      <w:pPr>
+        <w:pStyle w:val="ListBullet"/>
+      </w:pPr>
+      <w:r>
+        <w:t>menu_subitems (scripts_db/2026-08-13_create_menu_subitems.sql): subitems administrables del navbar por sección (quienes-somos, comunicaciones, publicaciones, educación-vial, aplicaciones y normas-legales) e idioma, con campos label_es, label_en, url, external (abrir en pestaña nueva), orden e isActive. Incluye seed inicial.</w:t>
+      </w:r>
+    </w:p>
+    <w:p>
+      <w:pPr>
+        <w:pStyle w:val="ListBullet"/>
+      </w:pPr>
+      <w:r>
+        <w:t>accesos_rapidos (scripts_db/2026-08-13_create_accesos_rapidos.sql): tarjetas bilingües (ES/EN) bajo el mapa de siniestros de la home, con eyebrow, título, descripción, texto y enlace del botón, e imagen. Incluye seed con Educación Vial y Revista.</w:t>
+      </w:r>
+    </w:p>
+    <w:p>
+      <w:pPr>
+        <w:pStyle w:val="ListBullet"/>
+      </w:pPr>
+      <w:r>
+        <w:t>popup (ALTER, scripts_db/2026-08-13_popup_carrusel.sql): se añade el campo posicion para convertir la fila única en carrusel de slides; el campo estado sigue siendo global.</w:t>
+      </w:r>
+    </w:p>
+    <w:p>
+      <w:pPr>
+        <w:pStyle w:val="ListBullet"/>
+      </w:pPr>
+      <w:r>
+        <w:t>programa (ALTER, scripts_db/2026-08-12_add_programa_descripcion_imagen.sql): se añaden descripcion (TEXT) e imagen (VARCHAR(500)) para la página de detalle público /programas/:slug.</w:t>
+      </w:r>
+    </w:p>
+    <w:p>
+      <w:pPr>
+        <w:pStyle w:val="Heading2"/>
+      </w:pPr>
+      <w:r>
+        <w:t>5.2 Nuevos módulos del panel de administración</w:t>
+      </w:r>
+    </w:p>
+    <w:p>
+      <w:pPr>
+        <w:pStyle w:val="Heading3"/>
+      </w:pPr>
+      <w:r>
+        <w:t>5.2.1 Menú del Sitio (admin/src/pages/MenuSitio.tsx)</w:t>
+      </w:r>
+    </w:p>
+    <w:p>
+      <w:pPr/>
+      <w:r>
+        <w:t>Permite administrar los subitems del navbar por sección e idioma (ES/EN), sustituyendo los arrays hardcodeados previos.</w:t>
+      </w:r>
+    </w:p>
+    <w:p>
+      <w:pPr>
+        <w:pStyle w:val="ListBullet"/>
+      </w:pPr>
+      <w:r>
+        <w:t>Selector de idioma ES/EN y 6 secciones colapsables: Quiénes Somos, Comunicaciones, Publicaciones, Educación Vial, Aplicaciones y Normas Legales.</w:t>
+      </w:r>
+    </w:p>
+    <w:p>
+      <w:pPr>
+        <w:pStyle w:val="ListBullet"/>
+      </w:pPr>
+      <w:r>
+        <w:t>Por subitem: etiqueta (según idioma activo), url con datalist de rutas internas, checkbox «nueva pestaña» (external), activación y guardado individual.</w:t>
+      </w:r>
+    </w:p>
+    <w:p>
+      <w:pPr>
+        <w:pStyle w:val="ListBullet"/>
+      </w:pPr>
+      <w:r>
+        <w:t>Reordenamiento con flechas arriba/abajo (PUT /menu-subitems/order); añadir y eliminar subitems vía modal con confirmación.</w:t>
+      </w:r>
+    </w:p>
+    <w:p>
+      <w:pPr>
+        <w:pStyle w:val="Heading3"/>
+      </w:pPr>
+      <w:r>
+        <w:t>5.2.2 Accesos Rápidos (admin/src/pages/AccesosRapidos.tsx)</w:t>
+      </w:r>
+    </w:p>
+    <w:p>
+      <w:pPr/>
+      <w:r>
+        <w:t>Edita las tarjetas bilingües (ES/EN) que aparecen bajo el mapa de siniestros viales de la página de inicio.</w:t>
+      </w:r>
+    </w:p>
+    <w:p>
+      <w:pPr>
+        <w:pStyle w:val="ListBullet"/>
+      </w:pPr>
+      <w:r>
+        <w:t>Tabla con miniatura (zoom al hover), eyebrow, título, descripción, texto y enlace del botón.</w:t>
+      </w:r>
+    </w:p>
+    <w:p>
+      <w:pPr>
+        <w:pStyle w:val="ListBullet"/>
+      </w:pPr>
+      <w:r>
+        <w:t>Modal de crear/editar con subida de imagen (POST /accesos-rapidos/upload); eliminación con confirmación.</w:t>
+      </w:r>
+    </w:p>
+    <w:p>
+      <w:pPr>
+        <w:pStyle w:val="ListBullet"/>
+      </w:pPr>
+      <w:r>
+        <w:t>Backend: GET (con ?idioma=), POST, PUT y DELETE /accesos-rapidos.</w:t>
+      </w:r>
+    </w:p>
+    <w:p>
+      <w:pPr>
+        <w:pStyle w:val="Heading3"/>
+      </w:pPr>
+      <w:r>
+        <w:t>5.2.3 Educación Vial (admin/src/pages/EducacionVial.tsx)</w:t>
+      </w:r>
+    </w:p>
+    <w:p>
+      <w:pPr/>
+      <w:r>
+        <w:t>Nuevo módulo que reutiliza el componente YoutubeVideosManager para gestionar los videos de las secciones Webinars y Capacitaciones.</w:t>
+      </w:r>
+    </w:p>
+    <w:p>
+      <w:pPr>
+        <w:pStyle w:val="ListBullet"/>
+      </w:pPr>
+      <w:r>
+        <w:t>Pestañas Webinars y Capacitaciones; mismo flujo CRUD que YouTube (validación de URL youtu.be/watch/embed/shorts y miniatura automática).</w:t>
+      </w:r>
+    </w:p>
+    <w:p>
+      <w:pPr>
+        <w:pStyle w:val="ListBullet"/>
+      </w:pPr>
+      <w:r>
+        <w:t>Reflejo en el portal: paginador ONSV propio en /webinars y /capacitaciones.</w:t>
+      </w:r>
+    </w:p>
+    <w:p>
+      <w:pPr>
+        <w:pStyle w:val="Heading2"/>
+      </w:pPr>
+      <w:r>
+        <w:t>5.3 Mejoras a módulos existentes</w:t>
+      </w:r>
+    </w:p>
+    <w:p>
+      <w:pPr>
+        <w:pStyle w:val="Heading3"/>
+      </w:pPr>
+      <w:r>
+        <w:t>5.3.1 Popup — carrusel de slides</w:t>
+      </w:r>
+    </w:p>
+    <w:p>
+      <w:pPr/>
+      <w:r>
+        <w:t>El popup pasa de un aviso único a un carrusel de varias imágenes.</w:t>
+      </w:r>
+    </w:p>
+    <w:p>
+      <w:pPr>
+        <w:pStyle w:val="ListBullet"/>
+      </w:pPr>
+      <w:r>
+        <w:t>Múltiples slides con campo posicion; subida de imagen y enlace por slide; reordenamiento con flechas (PUT /popup/order).</w:t>
+      </w:r>
+    </w:p>
+    <w:p>
+      <w:pPr>
+        <w:pStyle w:val="ListBullet"/>
+      </w:pPr>
+      <w:r>
+        <w:t>Activación global del popup (estado) independiente de los slides.</w:t>
+      </w:r>
+    </w:p>
+    <w:p>
+      <w:pPr>
+        <w:pStyle w:val="ListBullet"/>
+      </w:pPr>
+      <w:r>
+        <w:t>Endpoints nuevos: POST /popup/slides, PUT /popup/slides/:id, DELETE /popup/slides/:id y PUT /popup/order.</w:t>
+      </w:r>
+    </w:p>
+    <w:p>
+      <w:pPr>
+        <w:pStyle w:val="ListBullet"/>
+      </w:pPr>
+      <w:r>
+        <w:t>En el portal (views/partials/default/campaign-modal.hbs): carrusel .popup-carousel con flechas, botón «Leer más» dinámico por slide, botón Compartir (Web Share API con fallback a WhatsApp) y botones sociales Facebook/Twitter tomados del footer.</w:t>
+      </w:r>
+    </w:p>
+    <w:p>
+      <w:pPr>
+        <w:pStyle w:val="Heading3"/>
+      </w:pPr>
+      <w:r>
+        <w:t>5.3.2 Programas — descripción e imagen</w:t>
+      </w:r>
+    </w:p>
+    <w:p>
+      <w:pPr/>
+      <w:r>
+        <w:t>El módulo Programas incorpora los nuevos campos descripcion e imagen.</w:t>
+      </w:r>
+    </w:p>
+    <w:p>
+      <w:pPr>
+        <w:pStyle w:val="ListBullet"/>
+      </w:pPr>
+      <w:r>
+        <w:t>Tabla y modal de edición con Título, Descripción (textarea), Enlace web, Imagen (POST /programas/upload) y estado activo.</w:t>
+      </w:r>
+    </w:p>
+    <w:p>
+      <w:pPr>
+        <w:pStyle w:val="ListBullet"/>
+      </w:pPr>
+      <w:r>
+        <w:t>Código autogenerado por slug cuando se deja vacío.</w:t>
+      </w:r>
+    </w:p>
+    <w:p>
+      <w:pPr>
+        <w:pStyle w:val="ListBullet"/>
+      </w:pPr>
+      <w:r>
+        <w:t>Nueva página de detalle pública /programas/:slug (views/pages/programa.hbs) con thumbnail, título, descripción y botón «Visitar enlace web».</w:t>
+      </w:r>
+    </w:p>
+    <w:p>
+      <w:pPr>
+        <w:pStyle w:val="Heading3"/>
+      </w:pPr>
+      <w:r>
+        <w:t>5.3.3 YouTube — componente reutilizable</w:t>
+      </w:r>
+    </w:p>
+    <w:p>
+      <w:pPr/>
+      <w:r>
+        <w:t>La gestión de videos de YouTube se refactoriza en un componente genérico reutilizable.</w:t>
+      </w:r>
+    </w:p>
+    <w:p>
+      <w:pPr>
+        <w:pStyle w:val="ListBullet"/>
+      </w:pPr>
+      <w:r>
+        <w:t>admin/src/components/YoutubeVideosManager.tsx expone CRUD por sección con validación de URL (youtu.be, watch, embed y shorts), miniatura automática y paginador de 5.</w:t>
+      </w:r>
+    </w:p>
+    <w:p>
+      <w:pPr>
+        <w:pStyle w:val="ListBullet"/>
+      </w:pPr>
+      <w:r>
+        <w:t>admin/src/pages/YoutubeVideos.tsx lo usa para la sección home; admin/src/pages/EducacionVial.tsx para las secciones webinars y capacitaciones.</w:t>
+      </w:r>
+    </w:p>
+    <w:p>
+      <w:pPr>
+        <w:pStyle w:val="ListBullet"/>
+      </w:pPr>
+      <w:r>
+        <w:t>En el portal, la home muestra youtubeTopVideos y las rutas /webinars y /capacitaciones consumen getYoutubeVideos por sección.</w:t>
+      </w:r>
+    </w:p>
+    <w:p>
+      <w:pPr>
+        <w:pStyle w:val="Heading2"/>
+      </w:pPr>
+      <w:r>
+        <w:t>5.4 Nuevos endpoints de la API admin (routes/admin/api.js)</w:t>
+      </w:r>
+    </w:p>
+    <w:p>
+      <w:pPr>
+        <w:pStyle w:val="ListBullet"/>
+      </w:pPr>
+      <w:r>
+        <w:t>Menú del sitio: GET, POST, PUT y DELETE /menu-subitems, además de PUT /menu-subitems/order (constante MENU_SECCIONES).</w:t>
+      </w:r>
+    </w:p>
+    <w:p>
+      <w:pPr>
+        <w:pStyle w:val="ListBullet"/>
+      </w:pPr>
+      <w:r>
+        <w:t>Accesos rápidos: GET (con ?idioma=), POST, PUT y DELETE /accesos-rapidos, y POST /accesos-rapidos/upload.</w:t>
+      </w:r>
+    </w:p>
+    <w:p>
+      <w:pPr>
+        <w:pStyle w:val="ListBullet"/>
+      </w:pPr>
+      <w:r>
+        <w:t>Popup carrusel: POST /popup/slides, PUT /popup/slides/:id, DELETE /popup/slides/:id y PUT /popup/order.</w:t>
+      </w:r>
+    </w:p>
+    <w:p>
+      <w:pPr>
+        <w:pStyle w:val="ListBullet"/>
+      </w:pPr>
+      <w:r>
+        <w:t>Programas: POST /programas/upload (imagen); los POST/PUT existentes ahora persisten descripcion e imagen.</w:t>
+      </w:r>
+    </w:p>
+    <w:p>
+      <w:pPr>
+        <w:pStyle w:val="ListBullet"/>
+      </w:pPr>
+      <w:r>
+        <w:t>YouTube videos: los endpoints existentes ahora aceptan sección home|webinars|capacitaciones (constante YOUTUBE_SECCIONES).</w:t>
+      </w:r>
+    </w:p>
+    <w:p>
+      <w:pPr>
+        <w:pStyle w:val="Heading2"/>
+      </w:pPr>
+      <w:r>
+        <w:t>5.5 Mejoras en el portal público</w:t>
+      </w:r>
+    </w:p>
+    <w:p>
+      <w:pPr>
+        <w:pStyle w:val="ListBullet"/>
+      </w:pPr>
+      <w:r>
+        <w:t>Página de inicio (views/index.hbs): las dos tarjetas estáticas (Educación Vial / Revista) se renderizan ahora desde un loop accesosRapidos con datos de BD; títulos de videos YouTube con line-clamp y title; imágenes de publicaciones con object-fit:contain.</w:t>
+      </w:r>
+    </w:p>
+    <w:p>
+      <w:pPr>
+        <w:pStyle w:val="ListBullet"/>
+      </w:pPr>
+      <w:r>
+        <w:t>Popup (campaign-modal.hbs): carrusel con flechas, botón «Leer más» dinámico, botón Compartir (Web Share API / WhatsApp) y botones sociales Facebook/Twitter.</w:t>
+      </w:r>
+    </w:p>
+    <w:p>
+      <w:pPr>
+        <w:pStyle w:val="ListBullet"/>
+      </w:pPr>
+      <w:r>
+        <w:t>Noticias y notas de prensa (noticias.hbs, notas-prensa.hbs): botones de compartir con data-url/data-title y navigator.share con fallback a WhatsApp.</w:t>
+      </w:r>
+    </w:p>
+    <w:p>
+      <w:pPr>
+        <w:pStyle w:val="ListBullet"/>
+      </w:pPr>
+      <w:r>
+        <w:t>Programas (programa.hbs): tarjeta de detalle con thumbnail (imagen o fallback degradado), título, descripción y botón «Visitar enlace web».</w:t>
+      </w:r>
+    </w:p>
+    <w:p>
+      <w:pPr>
+        <w:pStyle w:val="ListBullet"/>
+      </w:pPr>
+      <w:r>
+        <w:t>Webinars (webinars.hbs): paginador ONSV propio con clase custom-pag-btn (activo en rojo #C8102E) y enlaces a primera y última página.</w:t>
+      </w:r>
+    </w:p>
+    <w:p>
+      <w:pPr>
+        <w:pStyle w:val="Heading2"/>
+      </w:pPr>
+      <w:r>
+        <w:t>5.6 Cambios en el sidebar del panel</w:t>
+      </w:r>
+    </w:p>
+    <w:p>
+      <w:pPr>
+        <w:pStyle w:val="ListBullet"/>
+      </w:pPr>
+      <w:r>
+        <w:t>Items nuevos en la barra lateral: «Menú del sitio» (icono Navigation, ruta /menu-sitio), «Accesos Rápidos» (icono Zap, /accesos-rapidos), «YouTube» (icono MonitorPlay, /youtube como ítem explícito) y «Educación Vial» (icono GraduationCap, /educacion-vial).</w:t>
+      </w:r>
+    </w:p>
+    <w:p>
+      <w:pPr>
+        <w:pStyle w:val="ListBullet"/>
+      </w:pPr>
+      <w:r>
+        <w:t>El ítem «Misión — Visión» pasa a llamarse «Quienes Somos» (misma ruta /mision).</w:t>
+      </w:r>
+    </w:p>
+    <w:p>
+      <w:pPr>
+        <w:pStyle w:val="ListBullet"/>
+      </w:pPr>
+      <w:r>
+        <w:t>Se añade una franja superior (ribbon) con el texto «MINISTERIO DE TRANSPORTES Y COMUNICACIONES».</w:t>
+      </w:r>
+    </w:p>
+    <w:p>
+      <w:pPr>
+        <w:pStyle w:val="ListBullet"/>
+      </w:pPr>
+      <w:r>
+        <w:t>Orden actual del sidebar: Inicio · Menú del sitio · Banners · Accesos Rápidos · YouTube · Quienes Somos · Cifras · Regiones · Comunicaciones (Noticias / Notas de prensa / Eventos) · Publicaciones (Contenidos / Revistas) · Normas Legales · Analítica (Menú / Submenú) · Popup · Datos Abiertos (Datos / Categorías / Tipos) · Programas · Educación Vial · Pie de página · Usuarios.</w:t>
+      </w:r>
+    </w:p>
+    <w:p>
+      <w:r>
+        <w:t>Informe actualizado a partir del historial de git (rama dev), periodo 18/06/2026 a 13/08/2026. Total de archivos considerados: 579.</w:t>
       </w:r>
     </w:p>
     <w:p>

</xml_diff>